<commit_message>
Made Board Display addaptive to screen size, and added offset x, y to center
</commit_message>
<xml_diff>
--- a/Sprint 1 Task Assignments.docx
+++ b/Sprint 1 Task Assignments.docx
@@ -25,6 +25,16 @@
       <w:r>
         <w:t>README</w:t>
       </w:r>
+      <w:r>
+        <w:t xml:space="preserve"> – </w:t>
+      </w:r>
+      <w:r>
+        <w:rPr>
+          <w:b/>
+          <w:bCs/>
+        </w:rPr>
+        <w:t>Lyndell [DONE]</w:t>
+      </w:r>
     </w:p>
     <w:p>
       <w:pPr>
@@ -69,7 +79,13 @@
         <w:t>B</w:t>
       </w:r>
       <w:r>
-        <w:t xml:space="preserve">oard – </w:t>
+        <w:t>oard</w:t>
+      </w:r>
+      <w:r>
+        <w:t xml:space="preserve"> beginning</w:t>
+      </w:r>
+      <w:r>
+        <w:t xml:space="preserve"> – </w:t>
       </w:r>
       <w:r>
         <w:rPr>
@@ -78,6 +94,32 @@
         </w:rPr>
         <w:t>Isaac</w:t>
       </w:r>
+      <w:r>
+        <w:rPr>
+          <w:b/>
+          <w:bCs/>
+        </w:rPr>
+        <w:t xml:space="preserve"> [DONE]</w:t>
+      </w:r>
+    </w:p>
+    <w:p>
+      <w:pPr>
+        <w:pStyle w:val="ListParagraph"/>
+        <w:numPr>
+          <w:ilvl w:val="1"/>
+          <w:numId w:val="1"/>
+        </w:numPr>
+      </w:pPr>
+      <w:r>
+        <w:t xml:space="preserve">Modularize and fix Board Rendering – </w:t>
+      </w:r>
+      <w:r>
+        <w:rPr>
+          <w:b/>
+          <w:bCs/>
+        </w:rPr>
+        <w:t>Lyndell [DONE]</w:t>
+      </w:r>
     </w:p>
     <w:p>
       <w:pPr>
@@ -100,17 +142,30 @@
         </w:rPr>
         <w:t>Lyndell</w:t>
       </w:r>
-    </w:p>
-    <w:p>
-      <w:pPr>
-        <w:pStyle w:val="ListParagraph"/>
-        <w:numPr>
-          <w:ilvl w:val="1"/>
-          <w:numId w:val="1"/>
-        </w:numPr>
-      </w:pPr>
-      <w:r>
-        <w:t xml:space="preserve">Full UI -&gt; Main wiring - </w:t>
+      <w:r>
+        <w:rPr>
+          <w:b/>
+          <w:bCs/>
+        </w:rPr>
+        <w:t xml:space="preserve"> [DONE]</w:t>
+      </w:r>
+    </w:p>
+    <w:p>
+      <w:pPr>
+        <w:pStyle w:val="ListParagraph"/>
+        <w:numPr>
+          <w:ilvl w:val="1"/>
+          <w:numId w:val="1"/>
+        </w:numPr>
+      </w:pPr>
+      <w:r>
+        <w:t xml:space="preserve">Full UI -&gt; Main wiring </w:t>
+      </w:r>
+      <w:r>
+        <w:t>–</w:t>
+      </w:r>
+      <w:r>
+        <w:t xml:space="preserve"> </w:t>
       </w:r>
       <w:r>
         <w:rPr>
@@ -119,6 +174,13 @@
         </w:rPr>
         <w:t>Lyndell</w:t>
       </w:r>
+      <w:r>
+        <w:rPr>
+          <w:b/>
+          <w:bCs/>
+        </w:rPr>
+        <w:t xml:space="preserve"> [DONE]</w:t>
+      </w:r>
     </w:p>
     <w:p>
       <w:pPr>
@@ -160,15 +222,31 @@
         <w:t>Lyndell</w:t>
       </w:r>
       <w:r>
+        <w:rPr>
+          <w:b/>
+          <w:bCs/>
+        </w:rPr>
         <w:t xml:space="preserve"> </w:t>
       </w:r>
       <w:r>
+        <w:rPr>
+          <w:b/>
+          <w:bCs/>
+        </w:rPr>
         <w:t>[</w:t>
       </w:r>
       <w:r>
+        <w:rPr>
+          <w:b/>
+          <w:bCs/>
+        </w:rPr>
         <w:t>DONE</w:t>
       </w:r>
       <w:r>
+        <w:rPr>
+          <w:b/>
+          <w:bCs/>
+        </w:rPr>
         <w:t>]</w:t>
       </w:r>
     </w:p>

</xml_diff>